<commit_message>
feat: Dựng server uvicorn và test API thành công
- Dọn dẹp thư mục: Di chuyển các file smoke test cũ ngoài gốc vào thư mục `smoke_tests/`
- Tooling: Thêm `test_api.http` để hỗ trợ gọi và test trực tiếp REST API trên IDE
- Database: Viết `scripts/reset_and_seed_db.py` hỗ trợ tự động clear schema và nạp seed data.
- Mock Data: Cập nhật `database/seed_data.sql` thêm dữ liệu candidate mô phỏng "Nguyễn Hải Hưng" đang ứng tuyển vị trí AI Engineer kèm Cloudinary URL chuẩn để khớp với sample cv đặt tại gốc.
- Docs: Bổ sung chỉ dẫn chi tiết về E2E API Test vào `README.md`.
</commit_message>
<xml_diff>
--- a/docs/docx/tổng quan đề tài - Hưng (1).docx
+++ b/docs/docx/tổng quan đề tài - Hưng (1).docx
@@ -1959,21 +1959,6 @@
       <w:pPr>
         <w:pStyle w:val="ListParagraph"/>
         <w:numPr>
-          <w:ilvl w:val="1"/>
-          <w:numId w:val="7"/>
-        </w:numPr>
-      </w:pPr>
-      <w:r>
-        <w:t>Cover letter</w:t>
-      </w:r>
-      <w:r>
-        <w:t xml:space="preserve"> (nếu có)</w:t>
-      </w:r>
-    </w:p>
-    <w:p>
-      <w:pPr>
-        <w:pStyle w:val="ListParagraph"/>
-        <w:numPr>
           <w:ilvl w:val="0"/>
           <w:numId w:val="7"/>
         </w:numPr>
@@ -2037,7 +2022,7 @@
         <w:rPr>
           <w:noProof/>
         </w:rPr>
-        <w:t>8:21 AM</w:t>
+        <w:t>5:34 PM</w:t>
       </w:r>
       <w:r>
         <w:fldChar w:fldCharType="end"/>
@@ -2058,7 +2043,7 @@
         <w:rPr>
           <w:noProof/>
         </w:rPr>
-        <w:t>4/2/2026</w:t>
+        <w:t>4/11/2026</w:t>
       </w:r>
       <w:r>
         <w:fldChar w:fldCharType="end"/>
@@ -3980,6 +3965,7 @@
   <w:style w:type="character" w:default="1" w:styleId="DefaultParagraphFont">
     <w:name w:val="Default Paragraph Font"/>
     <w:uiPriority w:val="1"/>
+    <w:semiHidden/>
     <w:unhideWhenUsed/>
   </w:style>
   <w:style w:type="table" w:default="1" w:styleId="TableNormal">

</xml_diff>